<commit_message>
Please provide the diff or the list of changes so I can generate the commit message for you.
</commit_message>
<xml_diff>
--- a/iuh/môn/hkh-4/dinhTuyenChuyenMach/lab/lab1/lab1-LeThanhLong.docx
+++ b/iuh/môn/hkh-4/dinhTuyenChuyenMach/lab/lab1/lab1-LeThanhLong.docx
@@ -647,7 +647,39 @@
           <w:sz w:val="26"/>
           <w:szCs w:val="26"/>
         </w:rPr>
-        <w:t>Mon 29/06/2026</w:t>
+        <w:t xml:space="preserve">Mon </w:t>
+      </w:r>
+      <w:r>
+        <w:rPr>
+          <w:noProof/>
+          <w:sz w:val="26"/>
+          <w:szCs w:val="26"/>
+        </w:rPr>
+        <w:t>29</w:t>
+      </w:r>
+      <w:r>
+        <w:rPr>
+          <w:noProof/>
+          <w:sz w:val="26"/>
+          <w:szCs w:val="26"/>
+        </w:rPr>
+        <w:t>/</w:t>
+      </w:r>
+      <w:r>
+        <w:rPr>
+          <w:noProof/>
+          <w:sz w:val="26"/>
+          <w:szCs w:val="26"/>
+        </w:rPr>
+        <w:t>06</w:t>
+      </w:r>
+      <w:r>
+        <w:rPr>
+          <w:noProof/>
+          <w:sz w:val="26"/>
+          <w:szCs w:val="26"/>
+        </w:rPr>
+        <w:t>/2026</w:t>
       </w:r>
       <w:r>
         <w:rPr>

</xml_diff>